<commit_message>
preperations for official festo github
</commit_message>
<xml_diff>
--- a/doc/CMMTt111.dll v1.10.docx
+++ b/doc/CMMTt111.dll v1.10.docx
@@ -306,7 +306,31 @@
         <w:rPr>
           <w:lang w:val="en-US"/>
         </w:rPr>
-        <w:t xml:space="preserve"> how to use CMMTt111.dll to establish CMMT-AS-...-EP Modbus TCP communication between PC and CMMT-XX-EP/MP with visual studio sample application.   </w:t>
+        <w:t xml:space="preserve"> how to use CMMTt111.dll to establish CMMT-AS</w:t>
+      </w:r>
+      <w:r>
+        <w:rPr>
+          <w:lang w:val="en-US"/>
+        </w:rPr>
+        <w:t>/ST</w:t>
+      </w:r>
+      <w:r>
+        <w:rPr>
+          <w:lang w:val="en-US"/>
+        </w:rPr>
+        <w:t>-...-</w:t>
+      </w:r>
+      <w:r>
+        <w:rPr>
+          <w:lang w:val="en-US"/>
+        </w:rPr>
+        <w:t>MP</w:t>
+      </w:r>
+      <w:r>
+        <w:rPr>
+          <w:lang w:val="en-US"/>
+        </w:rPr>
+        <w:t xml:space="preserve"> Modbus TCP communication between PC and CMMT-XX-EP/MP with visual studio sample application.   </w:t>
       </w:r>
     </w:p>
     <w:p>
@@ -645,93 +669,29 @@
     </w:p>
     <w:p>
       <w:pPr>
-        <w:ind w:left="10" w:right="188"/>
-        <w:rPr>
-          <w:lang w:val="en-US"/>
-        </w:rPr>
-      </w:pPr>
-      <w:r>
-        <w:rPr>
-          <w:lang w:val="en-US"/>
-        </w:rPr>
-        <w:t xml:space="preserve">This documentation is the intellectual property of Festo SE &amp; Co. </w:t>
-      </w:r>
-      <w:r>
-        <w:t xml:space="preserve">KG, </w:t>
-      </w:r>
-      <w:proofErr w:type="spellStart"/>
-      <w:r>
-        <w:t>which</w:t>
-      </w:r>
-      <w:proofErr w:type="spellEnd"/>
-      <w:r>
-        <w:t xml:space="preserve"> also </w:t>
-      </w:r>
-      <w:proofErr w:type="spellStart"/>
-      <w:r>
-        <w:t>has</w:t>
-      </w:r>
-      <w:proofErr w:type="spellEnd"/>
-      <w:r>
-        <w:t xml:space="preserve"> </w:t>
-      </w:r>
-      <w:proofErr w:type="spellStart"/>
-      <w:r>
-        <w:t>the</w:t>
-      </w:r>
-      <w:proofErr w:type="spellEnd"/>
-      <w:r>
-        <w:t xml:space="preserve"> </w:t>
-      </w:r>
-      <w:proofErr w:type="spellStart"/>
-      <w:r>
-        <w:t>exclusive</w:t>
-      </w:r>
-      <w:proofErr w:type="spellEnd"/>
-      <w:r>
-        <w:t xml:space="preserve"> </w:t>
-      </w:r>
-      <w:proofErr w:type="spellStart"/>
-      <w:r>
-        <w:t>copyright</w:t>
-      </w:r>
-      <w:proofErr w:type="spellEnd"/>
-      <w:r>
-        <w:t xml:space="preserve">. </w:t>
-      </w:r>
-      <w:r>
-        <w:rPr>
-          <w:lang w:val="en-US"/>
-        </w:rPr>
-        <w:t xml:space="preserve">Any modification of the content, duplication or reprinting of this documentation as well as distribution to third parties can only be made with the express consent of Festo SE &amp; Co. KG.  </w:t>
-      </w:r>
-    </w:p>
-    <w:p>
-      <w:pPr>
-        <w:ind w:left="10" w:right="188"/>
-        <w:rPr>
-          <w:lang w:val="en-US"/>
-        </w:rPr>
-      </w:pPr>
-      <w:r>
-        <w:rPr>
-          <w:lang w:val="en-US"/>
-        </w:rPr>
-        <w:t xml:space="preserve">Festo SE &amp; Co KG reserves the right to make modifications to this document </w:t>
-      </w:r>
-      <w:proofErr w:type="gramStart"/>
-      <w:r>
-        <w:rPr>
-          <w:lang w:val="en-US"/>
-        </w:rPr>
-        <w:t>in whole</w:t>
-      </w:r>
-      <w:proofErr w:type="gramEnd"/>
-      <w:r>
-        <w:rPr>
-          <w:lang w:val="en-US"/>
-        </w:rPr>
-        <w:t xml:space="preserve"> or in part. All brand and product names are trademarks or registered trademarks of their respective owners. </w:t>
+        <w:spacing w:after="74" w:line="259" w:lineRule="auto"/>
+        <w:ind w:left="0" w:firstLine="0"/>
+        <w:rPr>
+          <w:lang w:val="en-US"/>
+        </w:rPr>
+      </w:pPr>
+      <w:r>
+        <w:rPr>
+          <w:lang w:val="en-US"/>
+        </w:rPr>
+        <w:t xml:space="preserve">Permission is hereby granted, free of charge, to any person obtaining a copy of this </w:t>
+      </w:r>
+      <w:r>
+        <w:rPr>
+          <w:lang w:val="en-US"/>
+        </w:rPr>
+        <w:t xml:space="preserve">software </w:t>
+      </w:r>
+      <w:r>
+        <w:rPr>
+          <w:lang w:val="en-US"/>
+        </w:rPr>
+        <w:t>and associated documentation files, to deal in the Software without restriction, including without limitation the rights to use, copy, modify, merge, publish, distribute, sublicense, and/or sell copies of the Software, and to permit persons to persons to whom the Software is furnished to do so, subject to the following conditions: The above copyright notice and this permission notice shall be included in all copies or substantial portions of the Software.</w:t>
       </w:r>
     </w:p>
     <w:p>
@@ -1019,6 +979,7 @@
         <w:rPr>
           <w:lang w:val="en-US"/>
         </w:rPr>
+        <w:lastRenderedPageBreak/>
         <w:t xml:space="preserve">Internet: </w:t>
       </w:r>
       <w:r>
@@ -1056,7 +1017,6 @@
         <w:rPr>
           <w:lang w:val="en-US"/>
         </w:rPr>
-        <w:lastRenderedPageBreak/>
         <w:t xml:space="preserve"> </w:t>
       </w:r>
     </w:p>
@@ -3480,14 +3440,9 @@
       <w:pPr>
         <w:ind w:left="10" w:right="188"/>
       </w:pPr>
-      <w:proofErr w:type="spellStart"/>
       <w:r>
         <w:lastRenderedPageBreak/>
-        <w:t>Important</w:t>
-      </w:r>
-      <w:proofErr w:type="spellEnd"/>
-      <w:r>
-        <w:t xml:space="preserve"> </w:t>
+        <w:t xml:space="preserve">Important </w:t>
       </w:r>
       <w:proofErr w:type="spellStart"/>
       <w:r>
@@ -3523,13 +3478,8 @@
         <w:ind w:left="429" w:hanging="432"/>
       </w:pPr>
       <w:bookmarkStart w:id="0" w:name="_Toc235015254"/>
-      <w:proofErr w:type="spellStart"/>
-      <w:r>
-        <w:t>Important</w:t>
-      </w:r>
-      <w:proofErr w:type="spellEnd"/>
-      <w:r>
-        <w:t xml:space="preserve"> </w:t>
+      <w:r>
+        <w:t xml:space="preserve">Important </w:t>
       </w:r>
       <w:proofErr w:type="spellStart"/>
       <w:r>
@@ -3749,13 +3699,7 @@
               <w:ind w:left="0" w:firstLine="0"/>
             </w:pPr>
             <w:r>
-              <w:t>V2.</w:t>
-            </w:r>
-            <w:r>
-              <w:t>11.0.657</w:t>
-            </w:r>
-            <w:r>
-              <w:t xml:space="preserve"> </w:t>
+              <w:t xml:space="preserve">V2.11.0.657 </w:t>
             </w:r>
           </w:p>
         </w:tc>
@@ -4171,23 +4115,7 @@
       </w:r>
       <w:proofErr w:type="spellEnd"/>
       <w:r>
-        <w:t xml:space="preserve"> </w:t>
-      </w:r>
-      <w:proofErr w:type="spellStart"/>
-      <w:r>
-        <w:t>of</w:t>
-      </w:r>
-      <w:proofErr w:type="spellEnd"/>
-      <w:r>
-        <w:t xml:space="preserve"> </w:t>
-      </w:r>
-      <w:proofErr w:type="spellStart"/>
-      <w:r>
-        <w:t>the</w:t>
-      </w:r>
-      <w:proofErr w:type="spellEnd"/>
-      <w:r>
-        <w:t xml:space="preserve"> </w:t>
+        <w:t xml:space="preserve"> of the </w:t>
       </w:r>
       <w:proofErr w:type="spellStart"/>
       <w:r>
@@ -4372,21 +4300,7 @@
             <w:rStyle w:val="Hyperlink"/>
             <w:lang w:val="en-US"/>
           </w:rPr>
-          <w:t>https://www.festo.com/assets/attachment/de/6</w:t>
-        </w:r>
-        <w:r>
-          <w:rPr>
-            <w:rStyle w:val="Hyperlink"/>
-            <w:lang w:val="en-US"/>
-          </w:rPr>
-          <w:t>6</w:t>
-        </w:r>
-        <w:r>
-          <w:rPr>
-            <w:rStyle w:val="Hyperlink"/>
-            <w:lang w:val="en-US"/>
-          </w:rPr>
-          <w:t>5942</w:t>
+          <w:t>https://www.festo.com/assets/attachment/de/665942</w:t>
         </w:r>
       </w:hyperlink>
     </w:p>
@@ -4464,23 +4378,7 @@
             <w:u w:val="single" w:color="0000FF"/>
             <w:lang w:val="en-US"/>
           </w:rPr>
-          <w:t>https://www.festo.com/my/en/a/8143</w:t>
-        </w:r>
-        <w:r>
-          <w:rPr>
-            <w:color w:val="0000FF"/>
-            <w:u w:val="single" w:color="0000FF"/>
-            <w:lang w:val="en-US"/>
-          </w:rPr>
-          <w:t>1</w:t>
-        </w:r>
-        <w:r>
-          <w:rPr>
-            <w:color w:val="0000FF"/>
-            <w:u w:val="single" w:color="0000FF"/>
-            <w:lang w:val="en-US"/>
-          </w:rPr>
-          <w:t>64/?q=CMMT</w:t>
+          <w:t>https://www.festo.com/my/en/a/8143164/?q=CMMT</w:t>
         </w:r>
       </w:hyperlink>
       <w:hyperlink r:id="rId23">
@@ -7186,6 +7084,9 @@
         <w:spacing w:after="0" w:line="259" w:lineRule="auto"/>
         <w:ind w:left="-1" w:right="5029" w:firstLine="0"/>
         <w:jc w:val="center"/>
+        <w:rPr>
+          <w:lang w:val="en-US"/>
+        </w:rPr>
       </w:pPr>
       <w:r>
         <w:rPr>
@@ -7226,6 +7127,9 @@
         </w:drawing>
       </w:r>
       <w:r>
+        <w:rPr>
+          <w:lang w:val="en-US"/>
+        </w:rPr>
         <w:t xml:space="preserve"> </w:t>
       </w:r>
     </w:p>
@@ -7301,6 +7205,9 @@
       <w:pPr>
         <w:spacing w:after="0" w:line="259" w:lineRule="auto"/>
         <w:ind w:left="0" w:firstLine="0"/>
+        <w:rPr>
+          <w:lang w:val="en-US"/>
+        </w:rPr>
       </w:pPr>
       <w:r>
         <w:rPr>
@@ -7468,6 +7375,9 @@
         </mc:AlternateContent>
       </w:r>
       <w:r>
+        <w:rPr>
+          <w:lang w:val="en-US"/>
+        </w:rPr>
         <w:t xml:space="preserve"> </w:t>
       </w:r>
     </w:p>
@@ -7580,6 +7490,9 @@
         <w:spacing w:after="0" w:line="259" w:lineRule="auto"/>
         <w:ind w:left="-1" w:right="38" w:firstLine="0"/>
         <w:jc w:val="right"/>
+        <w:rPr>
+          <w:lang w:val="en-US"/>
+        </w:rPr>
       </w:pPr>
       <w:r>
         <w:rPr>
@@ -7747,6 +7660,9 @@
         </mc:AlternateContent>
       </w:r>
       <w:r>
+        <w:rPr>
+          <w:lang w:val="en-US"/>
+        </w:rPr>
         <w:t xml:space="preserve"> </w:t>
       </w:r>
     </w:p>
@@ -8103,6 +8019,9 @@
         <w:spacing w:after="0" w:line="259" w:lineRule="auto"/>
         <w:ind w:left="0" w:right="1042" w:firstLine="0"/>
         <w:jc w:val="right"/>
+        <w:rPr>
+          <w:lang w:val="en-US"/>
+        </w:rPr>
       </w:pPr>
       <w:r>
         <w:rPr>
@@ -8144,6 +8063,9 @@
         </w:drawing>
       </w:r>
       <w:r>
+        <w:rPr>
+          <w:lang w:val="en-US"/>
+        </w:rPr>
         <w:t xml:space="preserve"> </w:t>
       </w:r>
     </w:p>
@@ -8197,6 +8119,9 @@
         <w:spacing w:after="0" w:line="259" w:lineRule="auto"/>
         <w:ind w:left="0" w:right="821" w:firstLine="0"/>
         <w:jc w:val="right"/>
+        <w:rPr>
+          <w:lang w:val="en-US"/>
+        </w:rPr>
       </w:pPr>
       <w:r>
         <w:rPr>
@@ -8237,6 +8162,9 @@
         </w:drawing>
       </w:r>
       <w:r>
+        <w:rPr>
+          <w:lang w:val="en-US"/>
+        </w:rPr>
         <w:t xml:space="preserve"> </w:t>
       </w:r>
     </w:p>
@@ -8621,6 +8549,9 @@
         <w:spacing w:after="0" w:line="259" w:lineRule="auto"/>
         <w:ind w:left="-1" w:firstLine="0"/>
         <w:jc w:val="right"/>
+        <w:rPr>
+          <w:lang w:val="en-US"/>
+        </w:rPr>
       </w:pPr>
       <w:r>
         <w:rPr>
@@ -8661,6 +8592,9 @@
         </w:drawing>
       </w:r>
       <w:r>
+        <w:rPr>
+          <w:lang w:val="en-US"/>
+        </w:rPr>
         <w:t xml:space="preserve"> </w:t>
       </w:r>
     </w:p>
@@ -9082,6 +9016,9 @@
         <w:spacing w:after="0" w:line="259" w:lineRule="auto"/>
         <w:ind w:left="0" w:right="1334" w:firstLine="0"/>
         <w:jc w:val="right"/>
+        <w:rPr>
+          <w:lang w:val="en-US"/>
+        </w:rPr>
       </w:pPr>
       <w:r>
         <w:rPr>
@@ -9122,6 +9059,9 @@
         </w:drawing>
       </w:r>
       <w:r>
+        <w:rPr>
+          <w:lang w:val="en-US"/>
+        </w:rPr>
         <w:t xml:space="preserve"> </w:t>
       </w:r>
     </w:p>
@@ -10034,13 +9974,8 @@
       <w:pPr>
         <w:ind w:left="10" w:right="188"/>
       </w:pPr>
-      <w:proofErr w:type="spellStart"/>
-      <w:r>
-        <w:t>To</w:t>
-      </w:r>
-      <w:proofErr w:type="spellEnd"/>
-      <w:r>
-        <w:t xml:space="preserve"> </w:t>
+      <w:r>
+        <w:t xml:space="preserve">To </w:t>
       </w:r>
       <w:proofErr w:type="spellStart"/>
       <w:r>
@@ -10839,15 +10774,7 @@
             </w:r>
             <w:proofErr w:type="gramEnd"/>
             <w:r>
-              <w:t xml:space="preserve"> </w:t>
-            </w:r>
-            <w:proofErr w:type="spellStart"/>
-            <w:r>
-              <w:t>stop</w:t>
-            </w:r>
-            <w:proofErr w:type="spellEnd"/>
-            <w:r>
-              <w:t xml:space="preserve"> </w:t>
+              <w:t xml:space="preserve"> stop </w:t>
             </w:r>
             <w:proofErr w:type="spellStart"/>
             <w:r>
@@ -11253,15 +11180,7 @@
             </w:r>
             <w:proofErr w:type="spellEnd"/>
             <w:r>
-              <w:t xml:space="preserve"> </w:t>
-            </w:r>
-            <w:proofErr w:type="spellStart"/>
-            <w:r>
-              <w:t>to</w:t>
-            </w:r>
-            <w:proofErr w:type="spellEnd"/>
-            <w:r>
-              <w:t xml:space="preserve"> </w:t>
+              <w:t xml:space="preserve"> to </w:t>
             </w:r>
             <w:proofErr w:type="spellStart"/>
             <w:r>
@@ -12435,7 +12354,15 @@
             </w:r>
             <w:proofErr w:type="spellEnd"/>
             <w:r>
-              <w:t xml:space="preserve">=3, RejectPositioningTask=0 </w:t>
+              <w:t xml:space="preserve">=3, </w:t>
+            </w:r>
+            <w:proofErr w:type="spellStart"/>
+            <w:r>
+              <w:t>RejectPositioningTask</w:t>
+            </w:r>
+            <w:proofErr w:type="spellEnd"/>
+            <w:r>
+              <w:t xml:space="preserve">=0 </w:t>
             </w:r>
           </w:p>
         </w:tc>
@@ -13292,15 +13219,7 @@
               <w:ind w:left="0" w:firstLine="0"/>
             </w:pPr>
             <w:r>
-              <w:t>MDI_Velocity1 = (</w:t>
-            </w:r>
-            <w:proofErr w:type="spellStart"/>
-            <w:r>
-              <w:t>TargetVelocity</w:t>
-            </w:r>
-            <w:proofErr w:type="spellEnd"/>
-            <w:r>
-              <w:t xml:space="preserve"> * </w:t>
+              <w:t xml:space="preserve">MDI_Velocity1 = (TargetVelocity * </w:t>
             </w:r>
             <w:proofErr w:type="spellStart"/>
             <w:r>
@@ -13373,15 +13292,7 @@
               <w:ind w:left="0" w:firstLine="0"/>
             </w:pPr>
             <w:r>
-              <w:t>MDI_Velocity2 = (</w:t>
-            </w:r>
-            <w:proofErr w:type="spellStart"/>
-            <w:r>
-              <w:t>TargetVelocity</w:t>
-            </w:r>
-            <w:proofErr w:type="spellEnd"/>
-            <w:r>
-              <w:t xml:space="preserve"> * </w:t>
+              <w:t xml:space="preserve">MDI_Velocity2 = (TargetVelocity * </w:t>
             </w:r>
             <w:proofErr w:type="spellStart"/>
             <w:r>
@@ -13796,15 +13707,7 @@
             </w:r>
             <w:proofErr w:type="spellEnd"/>
             <w:r>
-              <w:t xml:space="preserve"> = 200000ms = 200 </w:t>
-            </w:r>
-            <w:proofErr w:type="spellStart"/>
-            <w:r>
-              <w:t>second</w:t>
-            </w:r>
-            <w:proofErr w:type="spellEnd"/>
-            <w:r>
-              <w:t xml:space="preserve"> </w:t>
+              <w:t xml:space="preserve"> = 200000ms = 200 second </w:t>
             </w:r>
           </w:p>
         </w:tc>
@@ -14284,15 +14187,7 @@
             </w:r>
             <w:proofErr w:type="spellEnd"/>
             <w:r>
-              <w:t xml:space="preserve"> = 10000ms = 10 </w:t>
-            </w:r>
-            <w:proofErr w:type="spellStart"/>
-            <w:r>
-              <w:t>second</w:t>
-            </w:r>
-            <w:proofErr w:type="spellEnd"/>
-            <w:r>
-              <w:t xml:space="preserve"> </w:t>
+              <w:t xml:space="preserve"> = 10000ms = 10 second </w:t>
             </w:r>
           </w:p>
         </w:tc>
@@ -27075,13 +26970,8 @@
               <w:spacing w:after="0" w:line="259" w:lineRule="auto"/>
               <w:ind w:left="0" w:firstLine="0"/>
             </w:pPr>
-            <w:proofErr w:type="spellStart"/>
-            <w:r>
-              <w:t>TargetVelocity</w:t>
-            </w:r>
-            <w:proofErr w:type="spellEnd"/>
-            <w:r>
-              <w:t xml:space="preserve"> </w:t>
+            <w:r>
+              <w:t xml:space="preserve">TargetVelocity </w:t>
             </w:r>
           </w:p>
         </w:tc>
@@ -32293,6 +32183,9 @@
         <w:spacing w:after="0" w:line="259" w:lineRule="auto"/>
         <w:ind w:left="0" w:right="4" w:firstLine="0"/>
         <w:jc w:val="center"/>
+        <w:rPr>
+          <w:lang w:val="en-US"/>
+        </w:rPr>
       </w:pPr>
       <w:r>
         <w:rPr>
@@ -32334,6 +32227,9 @@
         </w:drawing>
       </w:r>
       <w:r>
+        <w:rPr>
+          <w:lang w:val="en-US"/>
+        </w:rPr>
         <w:t xml:space="preserve"> </w:t>
       </w:r>
     </w:p>
@@ -32693,7 +32589,7 @@
           <w:sz w:val="19"/>
           <w:lang w:val="en-US"/>
         </w:rPr>
-        <w:t>// m</w:t>
+        <w:t xml:space="preserve">// </w:t>
       </w:r>
       <w:proofErr w:type="spellStart"/>
       <w:r>
@@ -32703,7 +32599,7 @@
           <w:sz w:val="19"/>
           <w:lang w:val="en-US"/>
         </w:rPr>
-        <w:t>odbus</w:t>
+        <w:t>modbus</w:t>
       </w:r>
       <w:proofErr w:type="spellEnd"/>
       <w:r>
@@ -33411,7 +33307,25 @@
                 <w:color w:val="008000"/>
                 <w:sz w:val="19"/>
               </w:rPr>
-              <w:t xml:space="preserve"> value </w:t>
+              <w:t xml:space="preserve"> </w:t>
+            </w:r>
+            <w:proofErr w:type="spellStart"/>
+            <w:r>
+              <w:rPr>
+                <w:rFonts w:ascii="Consolas" w:eastAsia="Consolas" w:hAnsi="Consolas" w:cs="Consolas"/>
+                <w:color w:val="008000"/>
+                <w:sz w:val="19"/>
+              </w:rPr>
+              <w:t>value</w:t>
+            </w:r>
+            <w:proofErr w:type="spellEnd"/>
+            <w:r>
+              <w:rPr>
+                <w:rFonts w:ascii="Consolas" w:eastAsia="Consolas" w:hAnsi="Consolas" w:cs="Consolas"/>
+                <w:color w:val="008000"/>
+                <w:sz w:val="19"/>
+              </w:rPr>
+              <w:t xml:space="preserve"> </w:t>
             </w:r>
           </w:p>
         </w:tc>
@@ -34641,8 +34555,14 @@
     <w:p>
       <w:pPr>
         <w:ind w:left="10" w:right="188"/>
-      </w:pPr>
-      <w:r>
+        <w:rPr>
+          <w:lang w:val="en-US"/>
+        </w:rPr>
+      </w:pPr>
+      <w:r>
+        <w:rPr>
+          <w:lang w:val="en-US"/>
+        </w:rPr>
         <w:t xml:space="preserve">Response: </w:t>
       </w:r>
     </w:p>
@@ -34650,12 +34570,16 @@
       <w:pPr>
         <w:spacing w:after="35" w:line="248" w:lineRule="auto"/>
         <w:ind w:left="0" w:right="4677" w:firstLine="0"/>
+        <w:rPr>
+          <w:lang w:val="en-US"/>
+        </w:rPr>
       </w:pPr>
       <w:proofErr w:type="spellStart"/>
       <w:r>
         <w:rPr>
           <w:rFonts w:ascii="Consolas" w:eastAsia="Consolas" w:hAnsi="Consolas" w:cs="Consolas"/>
           <w:sz w:val="19"/>
+          <w:lang w:val="en-US"/>
         </w:rPr>
         <w:t>festoCMMT.ReadytobeSwitchedOn</w:t>
       </w:r>
@@ -34664,23 +34588,24 @@
         <w:rPr>
           <w:rFonts w:ascii="Consolas" w:eastAsia="Consolas" w:hAnsi="Consolas" w:cs="Consolas"/>
           <w:sz w:val="19"/>
+          <w:lang w:val="en-US"/>
         </w:rPr>
         <w:t xml:space="preserve"> == </w:t>
       </w:r>
-      <w:proofErr w:type="spellStart"/>
       <w:r>
         <w:rPr>
           <w:rFonts w:ascii="Consolas" w:eastAsia="Consolas" w:hAnsi="Consolas" w:cs="Consolas"/>
           <w:color w:val="0000FF"/>
           <w:sz w:val="19"/>
+          <w:lang w:val="en-US"/>
         </w:rPr>
         <w:t>true</w:t>
       </w:r>
-      <w:proofErr w:type="spellEnd"/>
       <w:r>
         <w:rPr>
           <w:rFonts w:ascii="Consolas" w:eastAsia="Consolas" w:hAnsi="Consolas" w:cs="Consolas"/>
           <w:sz w:val="19"/>
+          <w:lang w:val="en-US"/>
         </w:rPr>
         <w:t xml:space="preserve">;  </w:t>
       </w:r>
@@ -38049,7 +37974,15 @@
               <w:tab/>
             </w:r>
             <w:r>
-              <w:t xml:space="preserve">Set Positioning </w:t>
+              <w:t xml:space="preserve">Set </w:t>
+            </w:r>
+            <w:proofErr w:type="spellStart"/>
+            <w:r>
+              <w:t>Positioning</w:t>
+            </w:r>
+            <w:proofErr w:type="spellEnd"/>
+            <w:r>
+              <w:t xml:space="preserve"> </w:t>
             </w:r>
             <w:proofErr w:type="spellStart"/>
             <w:r>
@@ -42797,7 +42730,6 @@
   <w:style w:type="character" w:default="1" w:styleId="Absatz-Standardschriftart">
     <w:name w:val="Default Paragraph Font"/>
     <w:uiPriority w:val="1"/>
-    <w:semiHidden/>
     <w:unhideWhenUsed/>
   </w:style>
   <w:style w:type="table" w:default="1" w:styleId="NormaleTabelle">

</xml_diff>